<commit_message>
Updated the stock notes
</commit_message>
<xml_diff>
--- a/stock market/StocksNotes.docx
+++ b/stock market/StocksNotes.docx
@@ -59,7 +59,7 @@
           <w:r>
             <w:fldChar w:fldCharType="separate"/>
           </w:r>
-          <w:hyperlink w:anchor="_Toc209213921" w:history="1">
+          <w:hyperlink w:anchor="_Toc209900149" w:history="1">
             <w:r>
               <w:rPr>
                 <w:rStyle w:val="Hyperlink"/>
@@ -103,7 +103,7 @@
                 <w:noProof/>
                 <w:webHidden/>
               </w:rPr>
-              <w:instrText xml:space="preserve"> PAGEREF _Toc209213921 \h </w:instrText>
+              <w:instrText xml:space="preserve"> PAGEREF _Toc209900149 \h </w:instrText>
             </w:r>
             <w:r>
               <w:rPr>
@@ -149,7 +149,7 @@
               <w:lang w:eastAsia="en-IN"/>
             </w:rPr>
           </w:pPr>
-          <w:hyperlink w:anchor="_Toc209213922" w:history="1">
+          <w:hyperlink w:anchor="_Toc209900150" w:history="1">
             <w:r>
               <w:rPr>
                 <w:rStyle w:val="Hyperlink"/>
@@ -193,7 +193,7 @@
                 <w:noProof/>
                 <w:webHidden/>
               </w:rPr>
-              <w:instrText xml:space="preserve"> PAGEREF _Toc209213922 \h </w:instrText>
+              <w:instrText xml:space="preserve"> PAGEREF _Toc209900150 \h </w:instrText>
             </w:r>
             <w:r>
               <w:rPr>
@@ -239,7 +239,7 @@
               <w:lang w:eastAsia="en-IN"/>
             </w:rPr>
           </w:pPr>
-          <w:hyperlink w:anchor="_Toc209213923" w:history="1">
+          <w:hyperlink w:anchor="_Toc209900151" w:history="1">
             <w:r>
               <w:rPr>
                 <w:rStyle w:val="Hyperlink"/>
@@ -283,7 +283,7 @@
                 <w:noProof/>
                 <w:webHidden/>
               </w:rPr>
-              <w:instrText xml:space="preserve"> PAGEREF _Toc209213923 \h </w:instrText>
+              <w:instrText xml:space="preserve"> PAGEREF _Toc209900151 \h </w:instrText>
             </w:r>
             <w:r>
               <w:rPr>
@@ -329,7 +329,7 @@
               <w:lang w:eastAsia="en-IN"/>
             </w:rPr>
           </w:pPr>
-          <w:hyperlink w:anchor="_Toc209213924" w:history="1">
+          <w:hyperlink w:anchor="_Toc209900152" w:history="1">
             <w:r>
               <w:rPr>
                 <w:rStyle w:val="Hyperlink"/>
@@ -373,7 +373,7 @@
                 <w:noProof/>
                 <w:webHidden/>
               </w:rPr>
-              <w:instrText xml:space="preserve"> PAGEREF _Toc209213924 \h </w:instrText>
+              <w:instrText xml:space="preserve"> PAGEREF _Toc209900152 \h </w:instrText>
             </w:r>
             <w:r>
               <w:rPr>
@@ -419,7 +419,7 @@
               <w:lang w:eastAsia="en-IN"/>
             </w:rPr>
           </w:pPr>
-          <w:hyperlink w:anchor="_Toc209213925" w:history="1">
+          <w:hyperlink w:anchor="_Toc209900153" w:history="1">
             <w:r>
               <w:rPr>
                 <w:rStyle w:val="Hyperlink"/>
@@ -463,7 +463,7 @@
                 <w:noProof/>
                 <w:webHidden/>
               </w:rPr>
-              <w:instrText xml:space="preserve"> PAGEREF _Toc209213925 \h </w:instrText>
+              <w:instrText xml:space="preserve"> PAGEREF _Toc209900153 \h </w:instrText>
             </w:r>
             <w:r>
               <w:rPr>
@@ -509,7 +509,7 @@
               <w:lang w:eastAsia="en-IN"/>
             </w:rPr>
           </w:pPr>
-          <w:hyperlink w:anchor="_Toc209213926" w:history="1">
+          <w:hyperlink w:anchor="_Toc209900154" w:history="1">
             <w:r>
               <w:rPr>
                 <w:rStyle w:val="Hyperlink"/>
@@ -553,7 +553,7 @@
                 <w:noProof/>
                 <w:webHidden/>
               </w:rPr>
-              <w:instrText xml:space="preserve"> PAGEREF _Toc209213926 \h </w:instrText>
+              <w:instrText xml:space="preserve"> PAGEREF _Toc209900154 \h </w:instrText>
             </w:r>
             <w:r>
               <w:rPr>
@@ -573,7 +573,7 @@
                 <w:noProof/>
                 <w:webHidden/>
               </w:rPr>
-              <w:t>3</w:t>
+              <w:t>4</w:t>
             </w:r>
             <w:r>
               <w:rPr>
@@ -599,7 +599,7 @@
               <w:lang w:eastAsia="en-IN"/>
             </w:rPr>
           </w:pPr>
-          <w:hyperlink w:anchor="_Toc209213927" w:history="1">
+          <w:hyperlink w:anchor="_Toc209900155" w:history="1">
             <w:r>
               <w:rPr>
                 <w:rStyle w:val="Hyperlink"/>
@@ -643,7 +643,7 @@
                 <w:noProof/>
                 <w:webHidden/>
               </w:rPr>
-              <w:instrText xml:space="preserve"> PAGEREF _Toc209213927 \h </w:instrText>
+              <w:instrText xml:space="preserve"> PAGEREF _Toc209900155 \h </w:instrText>
             </w:r>
             <w:r>
               <w:rPr>
@@ -689,7 +689,7 @@
               <w:lang w:eastAsia="en-IN"/>
             </w:rPr>
           </w:pPr>
-          <w:hyperlink w:anchor="_Toc209213928" w:history="1">
+          <w:hyperlink w:anchor="_Toc209900156" w:history="1">
             <w:r>
               <w:rPr>
                 <w:rStyle w:val="Hyperlink"/>
@@ -733,7 +733,7 @@
                 <w:noProof/>
                 <w:webHidden/>
               </w:rPr>
-              <w:instrText xml:space="preserve"> PAGEREF _Toc209213928 \h </w:instrText>
+              <w:instrText xml:space="preserve"> PAGEREF _Toc209900156 \h </w:instrText>
             </w:r>
             <w:r>
               <w:rPr>
@@ -779,7 +779,7 @@
               <w:lang w:eastAsia="en-IN"/>
             </w:rPr>
           </w:pPr>
-          <w:hyperlink w:anchor="_Toc209213929" w:history="1">
+          <w:hyperlink w:anchor="_Toc209900157" w:history="1">
             <w:r>
               <w:rPr>
                 <w:rStyle w:val="Hyperlink"/>
@@ -823,7 +823,7 @@
                 <w:noProof/>
                 <w:webHidden/>
               </w:rPr>
-              <w:instrText xml:space="preserve"> PAGEREF _Toc209213929 \h </w:instrText>
+              <w:instrText xml:space="preserve"> PAGEREF _Toc209900157 \h </w:instrText>
             </w:r>
             <w:r>
               <w:rPr>
@@ -844,6 +844,240 @@
                 <w:webHidden/>
               </w:rPr>
               <w:t>4</w:t>
+            </w:r>
+            <w:r>
+              <w:rPr>
+                <w:noProof/>
+                <w:webHidden/>
+              </w:rPr>
+              <w:fldChar w:fldCharType="end"/>
+            </w:r>
+          </w:hyperlink>
+        </w:p>
+        <w:p>
+          <w:pPr>
+            <w:pStyle w:val="TOC2"/>
+            <w:tabs>
+              <w:tab w:val="left" w:pos="960"/>
+              <w:tab w:val="right" w:leader="dot" w:pos="9016"/>
+            </w:tabs>
+            <w:rPr>
+              <w:rFonts w:eastAsiaTheme="minorEastAsia"/>
+              <w:noProof/>
+              <w:sz w:val="24"/>
+              <w:szCs w:val="24"/>
+              <w:lang w:eastAsia="en-IN"/>
+            </w:rPr>
+          </w:pPr>
+          <w:hyperlink w:anchor="_Toc209900158" w:history="1">
+            <w:r>
+              <w:rPr>
+                <w:rStyle w:val="Hyperlink"/>
+                <w:noProof/>
+              </w:rPr>
+              <w:t>10.</w:t>
+            </w:r>
+            <w:r>
+              <w:rPr>
+                <w:rFonts w:eastAsiaTheme="minorEastAsia"/>
+                <w:noProof/>
+                <w:sz w:val="24"/>
+                <w:szCs w:val="24"/>
+                <w:lang w:eastAsia="en-IN"/>
+              </w:rPr>
+              <w:tab/>
+            </w:r>
+            <w:r>
+              <w:rPr>
+                <w:rStyle w:val="Hyperlink"/>
+                <w:noProof/>
+              </w:rPr>
+              <w:t>Best Stock and ETF to invest in feature</w:t>
+            </w:r>
+            <w:r>
+              <w:rPr>
+                <w:noProof/>
+                <w:webHidden/>
+              </w:rPr>
+              <w:tab/>
+            </w:r>
+            <w:r>
+              <w:rPr>
+                <w:noProof/>
+                <w:webHidden/>
+              </w:rPr>
+              <w:fldChar w:fldCharType="begin"/>
+            </w:r>
+            <w:r>
+              <w:rPr>
+                <w:noProof/>
+                <w:webHidden/>
+              </w:rPr>
+              <w:instrText xml:space="preserve"> PAGEREF _Toc209900158 \h </w:instrText>
+            </w:r>
+            <w:r>
+              <w:rPr>
+                <w:noProof/>
+                <w:webHidden/>
+              </w:rPr>
+            </w:r>
+            <w:r>
+              <w:rPr>
+                <w:noProof/>
+                <w:webHidden/>
+              </w:rPr>
+              <w:fldChar w:fldCharType="separate"/>
+            </w:r>
+            <w:r>
+              <w:rPr>
+                <w:noProof/>
+                <w:webHidden/>
+              </w:rPr>
+              <w:t>4</w:t>
+            </w:r>
+            <w:r>
+              <w:rPr>
+                <w:noProof/>
+                <w:webHidden/>
+              </w:rPr>
+              <w:fldChar w:fldCharType="end"/>
+            </w:r>
+          </w:hyperlink>
+        </w:p>
+        <w:p>
+          <w:pPr>
+            <w:pStyle w:val="TOC3"/>
+            <w:tabs>
+              <w:tab w:val="right" w:leader="dot" w:pos="9016"/>
+            </w:tabs>
+            <w:rPr>
+              <w:rFonts w:eastAsiaTheme="minorEastAsia"/>
+              <w:noProof/>
+              <w:sz w:val="24"/>
+              <w:szCs w:val="24"/>
+              <w:lang w:eastAsia="en-IN"/>
+            </w:rPr>
+          </w:pPr>
+          <w:hyperlink w:anchor="_Toc209900159" w:history="1">
+            <w:r>
+              <w:rPr>
+                <w:rStyle w:val="Hyperlink"/>
+                <w:noProof/>
+              </w:rPr>
+              <w:t>Stock</w:t>
+            </w:r>
+            <w:r>
+              <w:rPr>
+                <w:noProof/>
+                <w:webHidden/>
+              </w:rPr>
+              <w:tab/>
+            </w:r>
+            <w:r>
+              <w:rPr>
+                <w:noProof/>
+                <w:webHidden/>
+              </w:rPr>
+              <w:fldChar w:fldCharType="begin"/>
+            </w:r>
+            <w:r>
+              <w:rPr>
+                <w:noProof/>
+                <w:webHidden/>
+              </w:rPr>
+              <w:instrText xml:space="preserve"> PAGEREF _Toc209900159 \h </w:instrText>
+            </w:r>
+            <w:r>
+              <w:rPr>
+                <w:noProof/>
+                <w:webHidden/>
+              </w:rPr>
+            </w:r>
+            <w:r>
+              <w:rPr>
+                <w:noProof/>
+                <w:webHidden/>
+              </w:rPr>
+              <w:fldChar w:fldCharType="separate"/>
+            </w:r>
+            <w:r>
+              <w:rPr>
+                <w:noProof/>
+                <w:webHidden/>
+              </w:rPr>
+              <w:t>4</w:t>
+            </w:r>
+            <w:r>
+              <w:rPr>
+                <w:noProof/>
+                <w:webHidden/>
+              </w:rPr>
+              <w:fldChar w:fldCharType="end"/>
+            </w:r>
+          </w:hyperlink>
+        </w:p>
+        <w:p>
+          <w:pPr>
+            <w:pStyle w:val="TOC3"/>
+            <w:tabs>
+              <w:tab w:val="right" w:leader="dot" w:pos="9016"/>
+            </w:tabs>
+            <w:rPr>
+              <w:rFonts w:eastAsiaTheme="minorEastAsia"/>
+              <w:noProof/>
+              <w:sz w:val="24"/>
+              <w:szCs w:val="24"/>
+              <w:lang w:eastAsia="en-IN"/>
+            </w:rPr>
+          </w:pPr>
+          <w:hyperlink w:anchor="_Toc209900160" w:history="1">
+            <w:r>
+              <w:rPr>
+                <w:rStyle w:val="Hyperlink"/>
+                <w:noProof/>
+              </w:rPr>
+              <w:t>ETF</w:t>
+            </w:r>
+            <w:r>
+              <w:rPr>
+                <w:noProof/>
+                <w:webHidden/>
+              </w:rPr>
+              <w:tab/>
+            </w:r>
+            <w:r>
+              <w:rPr>
+                <w:noProof/>
+                <w:webHidden/>
+              </w:rPr>
+              <w:fldChar w:fldCharType="begin"/>
+            </w:r>
+            <w:r>
+              <w:rPr>
+                <w:noProof/>
+                <w:webHidden/>
+              </w:rPr>
+              <w:instrText xml:space="preserve"> PAGEREF _Toc209900160 \h </w:instrText>
+            </w:r>
+            <w:r>
+              <w:rPr>
+                <w:noProof/>
+                <w:webHidden/>
+              </w:rPr>
+            </w:r>
+            <w:r>
+              <w:rPr>
+                <w:noProof/>
+                <w:webHidden/>
+              </w:rPr>
+              <w:fldChar w:fldCharType="separate"/>
+            </w:r>
+            <w:r>
+              <w:rPr>
+                <w:noProof/>
+                <w:webHidden/>
+              </w:rPr>
+              <w:t>5</w:t>
             </w:r>
             <w:r>
               <w:rPr>
@@ -894,9 +1128,8 @@
           <w:numId w:val="2"/>
         </w:numPr>
       </w:pPr>
-      <w:bookmarkStart w:id="0" w:name="_Toc209213921"/>
-      <w:r>
-        <w:lastRenderedPageBreak/>
+      <w:bookmarkStart w:id="0" w:name="_Toc209900149"/>
+      <w:r>
         <w:t>Check intrinsic value firs</w:t>
       </w:r>
       <w:r>
@@ -941,7 +1174,7 @@
           <w:numId w:val="2"/>
         </w:numPr>
       </w:pPr>
-      <w:bookmarkStart w:id="1" w:name="_Toc209213922"/>
+      <w:bookmarkStart w:id="1" w:name="_Toc209900150"/>
       <w:r>
         <w:t>Explain the difference between Debt and Equity</w:t>
       </w:r>
@@ -1519,6 +1752,7 @@
               <w:spacing w:after="160" w:line="259" w:lineRule="auto"/>
             </w:pPr>
             <w:r>
+              <w:lastRenderedPageBreak/>
               <w:t>Example</w:t>
             </w:r>
           </w:p>
@@ -1569,7 +1803,7 @@
           <w:numId w:val="2"/>
         </w:numPr>
       </w:pPr>
-      <w:bookmarkStart w:id="2" w:name="_Toc209213923"/>
+      <w:bookmarkStart w:id="2" w:name="_Toc209900151"/>
       <w:r>
         <w:t>Check ratios</w:t>
       </w:r>
@@ -2147,7 +2381,7 @@
           <w:numId w:val="2"/>
         </w:numPr>
       </w:pPr>
-      <w:bookmarkStart w:id="3" w:name="_Toc209213924"/>
+      <w:bookmarkStart w:id="3" w:name="_Toc209900152"/>
       <w:r>
         <w:t>Check balance sheet</w:t>
       </w:r>
@@ -2216,7 +2450,7 @@
           <w:numId w:val="2"/>
         </w:numPr>
       </w:pPr>
-      <w:bookmarkStart w:id="4" w:name="_Toc209213925"/>
+      <w:bookmarkStart w:id="4" w:name="_Toc209900153"/>
       <w:r>
         <w:t>Business</w:t>
       </w:r>
@@ -2243,8 +2477,9 @@
           <w:numId w:val="2"/>
         </w:numPr>
       </w:pPr>
-      <w:bookmarkStart w:id="5" w:name="_Toc209213926"/>
-      <w:r>
+      <w:bookmarkStart w:id="5" w:name="_Toc209900154"/>
+      <w:r>
+        <w:lastRenderedPageBreak/>
         <w:t>Monopoly</w:t>
       </w:r>
       <w:bookmarkEnd w:id="5"/>
@@ -2273,9 +2508,8 @@
           <w:numId w:val="2"/>
         </w:numPr>
       </w:pPr>
-      <w:bookmarkStart w:id="6" w:name="_Toc209213927"/>
-      <w:r>
-        <w:lastRenderedPageBreak/>
+      <w:bookmarkStart w:id="6" w:name="_Toc209900155"/>
+      <w:r>
         <w:t>Main Types of Mutual Fund</w:t>
       </w:r>
       <w:bookmarkEnd w:id="6"/>
@@ -2334,18 +2568,24 @@
         <w:t>Mid Cap Fund</w:t>
       </w:r>
       <w:r>
-        <w:t xml:space="preserve">: risk is medium, but hike is greater as compared to large </w:t>
-      </w:r>
-      <w:proofErr w:type="gramStart"/>
-      <w:r>
-        <w:t>cap</w:t>
+        <w:t>: risk is medium, but hike is greater as compared to large cap</w:t>
+      </w:r>
+      <w:r>
+        <w:t xml:space="preserve"> </w:t>
       </w:r>
       <w:r>
         <w:t>(</w:t>
       </w:r>
-      <w:proofErr w:type="gramEnd"/>
-      <w:r>
-        <w:t>, invest for 3-5 year)</w:t>
+      <w:r>
+        <w:rPr>
+          <w:b/>
+          <w:bCs/>
+          <w:highlight w:val="yellow"/>
+        </w:rPr>
+        <w:t>invest for 3-5 year</w:t>
+      </w:r>
+      <w:r>
+        <w:t>)</w:t>
       </w:r>
     </w:p>
     <w:p>
@@ -2389,30 +2629,24 @@
       <w:r>
         <w:t xml:space="preserve">: This cap can invest the money in above three </w:t>
       </w:r>
-      <w:proofErr w:type="gramStart"/>
-      <w:r>
-        <w:t>cap</w:t>
-      </w:r>
-      <w:proofErr w:type="gramEnd"/>
+      <w:r>
+        <w:t>caps</w:t>
+      </w:r>
       <w:r>
         <w:t xml:space="preserve">, </w:t>
       </w:r>
       <w:r>
         <w:t xml:space="preserve">but it </w:t>
       </w:r>
-      <w:proofErr w:type="gramStart"/>
-      <w:r>
-        <w:t>has to</w:t>
-      </w:r>
-      <w:proofErr w:type="gramEnd"/>
+      <w:r>
+        <w:t>must</w:t>
+      </w:r>
       <w:r>
         <w:t xml:space="preserve"> how much money it </w:t>
       </w:r>
-      <w:proofErr w:type="gramStart"/>
-      <w:r>
-        <w:t>investing</w:t>
-      </w:r>
-      <w:proofErr w:type="gramEnd"/>
+      <w:r>
+        <w:t>is investing</w:t>
+      </w:r>
       <w:r>
         <w:t xml:space="preserve"> at which cap</w:t>
       </w:r>
@@ -2429,27 +2663,55 @@
         <w:t>Flexi Cap Fund</w:t>
       </w:r>
       <w:r>
-        <w:t xml:space="preserve">: It can invest anywhere and doesn’t need to tell </w:t>
-      </w:r>
-      <w:proofErr w:type="gramStart"/>
-      <w:r>
-        <w:t>anything</w:t>
+        <w:t>: It can invest anywhere and doesn’t need to tell anything</w:t>
+      </w:r>
+      <w:r>
+        <w:t xml:space="preserve"> </w:t>
       </w:r>
       <w:r>
         <w:t>(</w:t>
       </w:r>
-      <w:proofErr w:type="gramEnd"/>
-      <w:r>
+      <w:r>
+        <w:rPr>
+          <w:b/>
+          <w:bCs/>
+          <w:highlight w:val="yellow"/>
+        </w:rPr>
         <w:t xml:space="preserve">small, multi &amp; flexi best for more than 5 </w:t>
       </w:r>
       <w:proofErr w:type="spellStart"/>
       <w:r>
+        <w:rPr>
+          <w:b/>
+          <w:bCs/>
+          <w:highlight w:val="yellow"/>
+        </w:rPr>
         <w:t>year</w:t>
       </w:r>
       <w:r>
+        <w:rPr>
+          <w:b/>
+          <w:bCs/>
+          <w:highlight w:val="yellow"/>
+        </w:rPr>
         <w:t>+index</w:t>
       </w:r>
       <w:proofErr w:type="spellEnd"/>
+      <w:r>
+        <w:rPr>
+          <w:b/>
+          <w:bCs/>
+        </w:rPr>
+        <w:t xml:space="preserve"> </w:t>
+      </w:r>
+      <w:r>
+        <w:rPr>
+          <w:b/>
+          <w:bCs/>
+          <w:highlight w:val="yellow"/>
+        </w:rPr>
+        <w:t>fund</w:t>
+      </w:r>
       <w:r>
         <w:t>)</w:t>
       </w:r>
@@ -2481,7 +2743,7 @@
           <w:numId w:val="2"/>
         </w:numPr>
       </w:pPr>
-      <w:bookmarkStart w:id="7" w:name="_Toc209213928"/>
+      <w:bookmarkStart w:id="7" w:name="_Toc209900156"/>
       <w:r>
         <w:t>ETF (Exchange -Traded Fund)</w:t>
       </w:r>
@@ -2508,7 +2770,7 @@
           <w:numId w:val="2"/>
         </w:numPr>
       </w:pPr>
-      <w:bookmarkStart w:id="8" w:name="_Toc209213929"/>
+      <w:bookmarkStart w:id="8" w:name="_Toc209900157"/>
       <w:r>
         <w:t>Buy this ETF</w:t>
       </w:r>
@@ -2598,12 +2860,885 @@
         <w:t>MON100</w:t>
       </w:r>
     </w:p>
-    <w:p>
-      <w:pPr>
-        <w:ind w:left="720"/>
-      </w:pPr>
-    </w:p>
     <w:p/>
+    <w:p>
+      <w:pPr>
+        <w:pStyle w:val="Heading2"/>
+        <w:numPr>
+          <w:ilvl w:val="0"/>
+          <w:numId w:val="2"/>
+        </w:numPr>
+      </w:pPr>
+      <w:bookmarkStart w:id="9" w:name="_Toc209900158"/>
+      <w:r>
+        <w:t>Best Stock and ETF to invest in feature</w:t>
+      </w:r>
+      <w:bookmarkEnd w:id="9"/>
+    </w:p>
+    <w:p>
+      <w:pPr>
+        <w:pStyle w:val="Heading3"/>
+      </w:pPr>
+      <w:bookmarkStart w:id="10" w:name="_Toc209900159"/>
+      <w:r>
+        <w:t>Stock</w:t>
+      </w:r>
+      <w:bookmarkEnd w:id="10"/>
+    </w:p>
+    <w:p>
+      <w:pPr>
+        <w:pStyle w:val="Heading4"/>
+      </w:pPr>
+      <w:r>
+        <w:t>Gold Stock</w:t>
+      </w:r>
+    </w:p>
+    <w:p>
+      <w:pPr>
+        <w:pStyle w:val="ListParagraph"/>
+        <w:numPr>
+          <w:ilvl w:val="0"/>
+          <w:numId w:val="5"/>
+        </w:numPr>
+      </w:pPr>
+      <w:hyperlink r:id="rId6" w:history="1">
+        <w:r>
+          <w:rPr>
+            <w:rStyle w:val="Hyperlink"/>
+          </w:rPr>
+          <w:t>Titan Compa</w:t>
+        </w:r>
+        <w:r>
+          <w:rPr>
+            <w:rStyle w:val="Hyperlink"/>
+          </w:rPr>
+          <w:t>n</w:t>
+        </w:r>
+        <w:r>
+          <w:rPr>
+            <w:rStyle w:val="Hyperlink"/>
+          </w:rPr>
+          <w:t>y Ltd</w:t>
+        </w:r>
+      </w:hyperlink>
+    </w:p>
+    <w:p>
+      <w:pPr>
+        <w:pStyle w:val="ListParagraph"/>
+        <w:numPr>
+          <w:ilvl w:val="0"/>
+          <w:numId w:val="5"/>
+        </w:numPr>
+      </w:pPr>
+      <w:hyperlink r:id="rId7" w:history="1">
+        <w:r>
+          <w:rPr>
+            <w:rStyle w:val="Hyperlink"/>
+          </w:rPr>
+          <w:t>Muthoot Fin</w:t>
+        </w:r>
+        <w:r>
+          <w:rPr>
+            <w:rStyle w:val="Hyperlink"/>
+          </w:rPr>
+          <w:t>a</w:t>
+        </w:r>
+        <w:r>
+          <w:rPr>
+            <w:rStyle w:val="Hyperlink"/>
+          </w:rPr>
+          <w:t>nce Ltd</w:t>
+        </w:r>
+      </w:hyperlink>
+    </w:p>
+    <w:p>
+      <w:pPr>
+        <w:pStyle w:val="ListParagraph"/>
+        <w:numPr>
+          <w:ilvl w:val="0"/>
+          <w:numId w:val="5"/>
+        </w:numPr>
+      </w:pPr>
+      <w:hyperlink r:id="rId8" w:history="1">
+        <w:r>
+          <w:rPr>
+            <w:rStyle w:val="Hyperlink"/>
+          </w:rPr>
+          <w:t>Kalyan Jewellers India Ltd</w:t>
+        </w:r>
+      </w:hyperlink>
+    </w:p>
+    <w:p>
+      <w:pPr>
+        <w:pStyle w:val="Heading4"/>
+      </w:pPr>
+      <w:r>
+        <w:t>Silver Stock</w:t>
+      </w:r>
+    </w:p>
+    <w:p>
+      <w:pPr>
+        <w:pStyle w:val="ListParagraph"/>
+        <w:numPr>
+          <w:ilvl w:val="0"/>
+          <w:numId w:val="6"/>
+        </w:numPr>
+      </w:pPr>
+      <w:hyperlink r:id="rId9" w:history="1">
+        <w:r>
+          <w:rPr>
+            <w:rStyle w:val="Hyperlink"/>
+          </w:rPr>
+          <w:t>Hindustan Zinc Ltd</w:t>
+        </w:r>
+      </w:hyperlink>
+    </w:p>
+    <w:p>
+      <w:pPr>
+        <w:pStyle w:val="ListParagraph"/>
+        <w:numPr>
+          <w:ilvl w:val="0"/>
+          <w:numId w:val="6"/>
+        </w:numPr>
+      </w:pPr>
+      <w:hyperlink r:id="rId10" w:history="1">
+        <w:r>
+          <w:rPr>
+            <w:rStyle w:val="Hyperlink"/>
+          </w:rPr>
+          <w:t>Vedanta Ltd</w:t>
+        </w:r>
+      </w:hyperlink>
+    </w:p>
+    <w:p>
+      <w:pPr>
+        <w:pStyle w:val="ListParagraph"/>
+        <w:numPr>
+          <w:ilvl w:val="0"/>
+          <w:numId w:val="6"/>
+        </w:numPr>
+      </w:pPr>
+      <w:hyperlink r:id="rId11" w:history="1">
+        <w:r>
+          <w:rPr>
+            <w:rStyle w:val="Hyperlink"/>
+          </w:rPr>
+          <w:t>NMDC Ltd</w:t>
+        </w:r>
+      </w:hyperlink>
+    </w:p>
+    <w:p>
+      <w:pPr>
+        <w:pStyle w:val="Heading4"/>
+      </w:pPr>
+      <w:r>
+        <w:t>Copper Stock</w:t>
+      </w:r>
+    </w:p>
+    <w:p>
+      <w:pPr>
+        <w:pStyle w:val="ListParagraph"/>
+        <w:numPr>
+          <w:ilvl w:val="0"/>
+          <w:numId w:val="7"/>
+        </w:numPr>
+      </w:pPr>
+      <w:hyperlink r:id="rId12" w:history="1">
+        <w:proofErr w:type="spellStart"/>
+        <w:r>
+          <w:rPr>
+            <w:rStyle w:val="Hyperlink"/>
+          </w:rPr>
+          <w:t>Cubex</w:t>
+        </w:r>
+        <w:proofErr w:type="spellEnd"/>
+        <w:r>
+          <w:rPr>
+            <w:rStyle w:val="Hyperlink"/>
+          </w:rPr>
+          <w:t xml:space="preserve"> </w:t>
+        </w:r>
+        <w:proofErr w:type="spellStart"/>
+        <w:r>
+          <w:rPr>
+            <w:rStyle w:val="Hyperlink"/>
+          </w:rPr>
+          <w:t>Tubings</w:t>
+        </w:r>
+        <w:proofErr w:type="spellEnd"/>
+        <w:r>
+          <w:rPr>
+            <w:rStyle w:val="Hyperlink"/>
+          </w:rPr>
+          <w:t xml:space="preserve"> Ltd</w:t>
+        </w:r>
+      </w:hyperlink>
+    </w:p>
+    <w:p>
+      <w:pPr>
+        <w:pStyle w:val="ListParagraph"/>
+        <w:numPr>
+          <w:ilvl w:val="0"/>
+          <w:numId w:val="7"/>
+        </w:numPr>
+      </w:pPr>
+      <w:hyperlink r:id="rId13" w:history="1">
+        <w:r>
+          <w:rPr>
+            <w:rStyle w:val="Hyperlink"/>
+          </w:rPr>
+          <w:t>Parmeshwar Metal Ltd</w:t>
+        </w:r>
+      </w:hyperlink>
+    </w:p>
+    <w:p>
+      <w:pPr>
+        <w:pStyle w:val="Heading4"/>
+      </w:pPr>
+      <w:r>
+        <w:t>Semiconductor Stock</w:t>
+      </w:r>
+    </w:p>
+    <w:p>
+      <w:pPr>
+        <w:pStyle w:val="ListParagraph"/>
+        <w:numPr>
+          <w:ilvl w:val="0"/>
+          <w:numId w:val="9"/>
+        </w:numPr>
+        <w:rPr>
+          <w:color w:val="467886" w:themeColor="hyperlink"/>
+        </w:rPr>
+      </w:pPr>
+      <w:r>
+        <w:rPr>
+          <w:color w:val="467886" w:themeColor="hyperlink"/>
+        </w:rPr>
+        <w:t>HCL Technologies Ltd</w:t>
+      </w:r>
+    </w:p>
+    <w:p>
+      <w:pPr>
+        <w:pStyle w:val="ListParagraph"/>
+        <w:numPr>
+          <w:ilvl w:val="0"/>
+          <w:numId w:val="9"/>
+        </w:numPr>
+        <w:rPr>
+          <w:color w:val="467886" w:themeColor="hyperlink"/>
+          <w:u w:val="single"/>
+        </w:rPr>
+      </w:pPr>
+      <w:hyperlink r:id="rId14" w:history="1">
+        <w:r>
+          <w:rPr>
+            <w:rStyle w:val="Hyperlink"/>
+          </w:rPr>
+          <w:t>Bharat Electronics Ltd</w:t>
+        </w:r>
+      </w:hyperlink>
+    </w:p>
+    <w:p>
+      <w:pPr>
+        <w:pStyle w:val="ListParagraph"/>
+        <w:numPr>
+          <w:ilvl w:val="0"/>
+          <w:numId w:val="9"/>
+        </w:numPr>
+        <w:rPr>
+          <w:color w:val="467886" w:themeColor="hyperlink"/>
+          <w:u w:val="single"/>
+        </w:rPr>
+      </w:pPr>
+      <w:r>
+        <w:rPr>
+          <w:color w:val="467886" w:themeColor="hyperlink"/>
+          <w:u w:val="single"/>
+        </w:rPr>
+        <w:t xml:space="preserve">CG Power and Industrial Solutions Limited </w:t>
+      </w:r>
+    </w:p>
+    <w:p>
+      <w:pPr>
+        <w:pStyle w:val="ListParagraph"/>
+        <w:numPr>
+          <w:ilvl w:val="0"/>
+          <w:numId w:val="9"/>
+        </w:numPr>
+        <w:rPr>
+          <w:color w:val="467886" w:themeColor="hyperlink"/>
+          <w:u w:val="single"/>
+        </w:rPr>
+      </w:pPr>
+      <w:r>
+        <w:rPr>
+          <w:color w:val="467886" w:themeColor="hyperlink"/>
+          <w:u w:val="single"/>
+        </w:rPr>
+        <w:t xml:space="preserve">Hitachi Energy India Limited </w:t>
+      </w:r>
+    </w:p>
+    <w:p>
+      <w:pPr>
+        <w:pStyle w:val="ListParagraph"/>
+        <w:numPr>
+          <w:ilvl w:val="0"/>
+          <w:numId w:val="9"/>
+        </w:numPr>
+        <w:rPr>
+          <w:color w:val="467886" w:themeColor="hyperlink"/>
+          <w:u w:val="single"/>
+        </w:rPr>
+      </w:pPr>
+      <w:r>
+        <w:rPr>
+          <w:color w:val="467886" w:themeColor="hyperlink"/>
+          <w:u w:val="single"/>
+        </w:rPr>
+        <w:t xml:space="preserve">V Guard Industries Limited </w:t>
+      </w:r>
+    </w:p>
+    <w:p>
+      <w:pPr>
+        <w:pStyle w:val="ListParagraph"/>
+        <w:numPr>
+          <w:ilvl w:val="0"/>
+          <w:numId w:val="9"/>
+        </w:numPr>
+        <w:rPr>
+          <w:color w:val="467886" w:themeColor="hyperlink"/>
+          <w:u w:val="single"/>
+        </w:rPr>
+      </w:pPr>
+      <w:r>
+        <w:rPr>
+          <w:color w:val="467886" w:themeColor="hyperlink"/>
+          <w:u w:val="single"/>
+        </w:rPr>
+        <w:t>Havells India Limited</w:t>
+      </w:r>
+    </w:p>
+    <w:p>
+      <w:pPr>
+        <w:pStyle w:val="ListParagraph"/>
+        <w:numPr>
+          <w:ilvl w:val="0"/>
+          <w:numId w:val="9"/>
+        </w:numPr>
+        <w:rPr>
+          <w:color w:val="467886" w:themeColor="hyperlink"/>
+          <w:u w:val="single"/>
+        </w:rPr>
+      </w:pPr>
+      <w:r>
+        <w:rPr>
+          <w:color w:val="467886" w:themeColor="hyperlink"/>
+          <w:u w:val="single"/>
+        </w:rPr>
+        <w:t>Dixon Technologies (India) Ltd</w:t>
+      </w:r>
+    </w:p>
+    <w:p>
+      <w:r>
+        <w:t xml:space="preserve"> </w:t>
+      </w:r>
+    </w:p>
+    <w:p>
+      <w:pPr>
+        <w:pStyle w:val="Heading3"/>
+      </w:pPr>
+      <w:bookmarkStart w:id="11" w:name="_Toc209900160"/>
+      <w:r>
+        <w:t>ETF</w:t>
+      </w:r>
+      <w:bookmarkEnd w:id="11"/>
+    </w:p>
+    <w:p>
+      <w:pPr>
+        <w:pStyle w:val="Heading4"/>
+      </w:pPr>
+      <w:r>
+        <w:t>Gold ETF</w:t>
+      </w:r>
+    </w:p>
+    <w:p>
+      <w:pPr>
+        <w:pStyle w:val="ListParagraph"/>
+        <w:numPr>
+          <w:ilvl w:val="0"/>
+          <w:numId w:val="10"/>
+        </w:numPr>
+      </w:pPr>
+      <w:r>
+        <w:t xml:space="preserve">Nippon India ETF Gold </w:t>
+      </w:r>
+      <w:proofErr w:type="spellStart"/>
+      <w:r>
+        <w:t>BeES</w:t>
+      </w:r>
+      <w:proofErr w:type="spellEnd"/>
+    </w:p>
+    <w:p>
+      <w:pPr>
+        <w:pStyle w:val="ListParagraph"/>
+        <w:numPr>
+          <w:ilvl w:val="0"/>
+          <w:numId w:val="10"/>
+        </w:numPr>
+      </w:pPr>
+      <w:r>
+        <w:t>SBI Gold ETF</w:t>
+      </w:r>
+    </w:p>
+    <w:p>
+      <w:pPr>
+        <w:pStyle w:val="ListParagraph"/>
+        <w:numPr>
+          <w:ilvl w:val="0"/>
+          <w:numId w:val="10"/>
+        </w:numPr>
+      </w:pPr>
+      <w:r>
+        <w:t xml:space="preserve">Kotak Gold </w:t>
+      </w:r>
+      <w:proofErr w:type="spellStart"/>
+      <w:r>
+        <w:t>Etf</w:t>
+      </w:r>
+      <w:proofErr w:type="spellEnd"/>
+    </w:p>
+    <w:p>
+      <w:pPr>
+        <w:pStyle w:val="ListParagraph"/>
+        <w:numPr>
+          <w:ilvl w:val="0"/>
+          <w:numId w:val="10"/>
+        </w:numPr>
+      </w:pPr>
+      <w:r>
+        <w:t>HDFC Gold Exchange Traded Fund</w:t>
+      </w:r>
+    </w:p>
+    <w:p>
+      <w:pPr>
+        <w:pStyle w:val="ListParagraph"/>
+        <w:numPr>
+          <w:ilvl w:val="0"/>
+          <w:numId w:val="10"/>
+        </w:numPr>
+      </w:pPr>
+      <w:r>
+        <w:t>ICICI Prudential Gold ETF</w:t>
+      </w:r>
+    </w:p>
+    <w:p>
+      <w:pPr>
+        <w:pStyle w:val="ListParagraph"/>
+        <w:numPr>
+          <w:ilvl w:val="0"/>
+          <w:numId w:val="10"/>
+        </w:numPr>
+      </w:pPr>
+      <w:hyperlink r:id="rId15" w:history="1">
+        <w:r>
+          <w:rPr>
+            <w:rStyle w:val="Hyperlink"/>
+          </w:rPr>
+          <w:t>https://www.tickertape.in/stocks/collections/gold-etfs</w:t>
+        </w:r>
+      </w:hyperlink>
+    </w:p>
+    <w:p/>
+    <w:p>
+      <w:pPr>
+        <w:pStyle w:val="Heading4"/>
+      </w:pPr>
+      <w:r>
+        <w:t>Silver ETF</w:t>
+      </w:r>
+    </w:p>
+    <w:p>
+      <w:pPr>
+        <w:pStyle w:val="ListParagraph"/>
+        <w:numPr>
+          <w:ilvl w:val="0"/>
+          <w:numId w:val="12"/>
+        </w:numPr>
+      </w:pPr>
+      <w:r>
+        <w:t>Nippon India Silver ETF: Ticker symbol: SILVERBEES.</w:t>
+      </w:r>
+    </w:p>
+    <w:p>
+      <w:pPr>
+        <w:pStyle w:val="ListParagraph"/>
+        <w:numPr>
+          <w:ilvl w:val="0"/>
+          <w:numId w:val="12"/>
+        </w:numPr>
+      </w:pPr>
+      <w:r>
+        <w:t>Kotak Silver ETF: Ticker symbol: SILVERK.</w:t>
+      </w:r>
+    </w:p>
+    <w:p>
+      <w:pPr>
+        <w:pStyle w:val="ListParagraph"/>
+        <w:numPr>
+          <w:ilvl w:val="0"/>
+          <w:numId w:val="12"/>
+        </w:numPr>
+      </w:pPr>
+      <w:r>
+        <w:t>SBI Silver ETF: Ticker symbol: SILVERSBI.</w:t>
+      </w:r>
+    </w:p>
+    <w:p>
+      <w:pPr>
+        <w:pStyle w:val="ListParagraph"/>
+        <w:numPr>
+          <w:ilvl w:val="0"/>
+          <w:numId w:val="12"/>
+        </w:numPr>
+      </w:pPr>
+      <w:r>
+        <w:t>HDFC Silver ETF: Ticker symbol: HDFCSILVER.</w:t>
+      </w:r>
+    </w:p>
+    <w:p>
+      <w:pPr>
+        <w:pStyle w:val="ListParagraph"/>
+        <w:numPr>
+          <w:ilvl w:val="0"/>
+          <w:numId w:val="12"/>
+        </w:numPr>
+      </w:pPr>
+      <w:r>
+        <w:t>ICICI Prudential Silver ETF: Ticker symbol: ICPRILSILVER.</w:t>
+      </w:r>
+    </w:p>
+    <w:p>
+      <w:pPr>
+        <w:pStyle w:val="ListParagraph"/>
+        <w:numPr>
+          <w:ilvl w:val="0"/>
+          <w:numId w:val="12"/>
+        </w:numPr>
+      </w:pPr>
+      <w:r>
+        <w:t>Aditya Birla Silver ETF: Ticker symbol: ADITYASILVER.</w:t>
+      </w:r>
+    </w:p>
+    <w:p>
+      <w:pPr>
+        <w:pStyle w:val="ListParagraph"/>
+        <w:numPr>
+          <w:ilvl w:val="0"/>
+          <w:numId w:val="12"/>
+        </w:numPr>
+      </w:pPr>
+      <w:r>
+        <w:t>Axis Silver ETF: Ticker symbol: AXISSILVER.</w:t>
+      </w:r>
+    </w:p>
+    <w:p/>
+    <w:p>
+      <w:pPr>
+        <w:pStyle w:val="Heading4"/>
+      </w:pPr>
+      <w:r>
+        <w:t>Semiconductor ETF</w:t>
+      </w:r>
+      <w:r>
+        <w:t xml:space="preserve"> </w:t>
+      </w:r>
+    </w:p>
+    <w:p>
+      <w:pPr>
+        <w:pStyle w:val="ListParagraph"/>
+        <w:numPr>
+          <w:ilvl w:val="0"/>
+          <w:numId w:val="13"/>
+        </w:numPr>
+      </w:pPr>
+      <w:r>
+        <w:t>There are no dedicated semiconductor Exchange Traded Funds (ETFs) listed or available for direct investment in India</w:t>
+      </w:r>
+    </w:p>
+    <w:p>
+      <w:pPr>
+        <w:pStyle w:val="Heading4"/>
+      </w:pPr>
+      <w:r>
+        <w:t>All-time best ETF to buy</w:t>
+      </w:r>
+    </w:p>
+    <w:p>
+      <w:pPr>
+        <w:pStyle w:val="ListParagraph"/>
+        <w:numPr>
+          <w:ilvl w:val="0"/>
+          <w:numId w:val="13"/>
+        </w:numPr>
+      </w:pPr>
+      <w:r>
+        <w:t>CPSE ETF</w:t>
+      </w:r>
+    </w:p>
+    <w:p>
+      <w:pPr>
+        <w:pStyle w:val="ListParagraph"/>
+        <w:numPr>
+          <w:ilvl w:val="0"/>
+          <w:numId w:val="13"/>
+        </w:numPr>
+      </w:pPr>
+      <w:r>
+        <w:t>UTI S&amp;P BSE Sensex ETF</w:t>
+      </w:r>
+    </w:p>
+    <w:p>
+      <w:pPr>
+        <w:pStyle w:val="ListParagraph"/>
+        <w:numPr>
+          <w:ilvl w:val="0"/>
+          <w:numId w:val="13"/>
+        </w:numPr>
+      </w:pPr>
+      <w:r>
+        <w:t>Bharat 22 ETF</w:t>
+      </w:r>
+    </w:p>
+    <w:p>
+      <w:pPr>
+        <w:pStyle w:val="ListParagraph"/>
+        <w:numPr>
+          <w:ilvl w:val="0"/>
+          <w:numId w:val="13"/>
+        </w:numPr>
+      </w:pPr>
+      <w:r>
+        <w:t xml:space="preserve">Nippon India ETF Nifty Bank </w:t>
+      </w:r>
+      <w:proofErr w:type="spellStart"/>
+      <w:r>
+        <w:t>BeES</w:t>
+      </w:r>
+      <w:proofErr w:type="spellEnd"/>
+    </w:p>
+    <w:p>
+      <w:pPr>
+        <w:pStyle w:val="ListParagraph"/>
+        <w:numPr>
+          <w:ilvl w:val="0"/>
+          <w:numId w:val="13"/>
+        </w:numPr>
+      </w:pPr>
+      <w:r>
+        <w:t>Kotak Nifty Bank ETF</w:t>
+      </w:r>
+    </w:p>
+    <w:p>
+      <w:pPr>
+        <w:pStyle w:val="ListParagraph"/>
+        <w:numPr>
+          <w:ilvl w:val="0"/>
+          <w:numId w:val="13"/>
+        </w:numPr>
+      </w:pPr>
+      <w:r>
+        <w:lastRenderedPageBreak/>
+        <w:t>SBI Nifty 50 ETF</w:t>
+      </w:r>
+    </w:p>
+    <w:p>
+      <w:pPr>
+        <w:pStyle w:val="ListParagraph"/>
+        <w:numPr>
+          <w:ilvl w:val="0"/>
+          <w:numId w:val="13"/>
+        </w:numPr>
+      </w:pPr>
+      <w:r>
+        <w:t>BHARAT Bond ETF-April 2023-Growth</w:t>
+      </w:r>
+    </w:p>
+    <w:p>
+      <w:pPr>
+        <w:pStyle w:val="ListParagraph"/>
+        <w:numPr>
+          <w:ilvl w:val="0"/>
+          <w:numId w:val="13"/>
+        </w:numPr>
+      </w:pPr>
+      <w:r>
+        <w:t>BHARAT Bond ETF-April 2030-Growth</w:t>
+      </w:r>
+    </w:p>
+    <w:p>
+      <w:pPr>
+        <w:pStyle w:val="ListParagraph"/>
+        <w:numPr>
+          <w:ilvl w:val="0"/>
+          <w:numId w:val="13"/>
+        </w:numPr>
+      </w:pPr>
+      <w:r>
+        <w:t>BHARAT Bond ETF-April 2032</w:t>
+      </w:r>
+    </w:p>
+    <w:p>
+      <w:pPr>
+        <w:pStyle w:val="ListParagraph"/>
+        <w:numPr>
+          <w:ilvl w:val="0"/>
+          <w:numId w:val="13"/>
+        </w:numPr>
+      </w:pPr>
+      <w:r>
+        <w:t xml:space="preserve">Nippon India ETF Gold </w:t>
+      </w:r>
+      <w:proofErr w:type="spellStart"/>
+      <w:r>
+        <w:t>BeES</w:t>
+      </w:r>
+      <w:proofErr w:type="spellEnd"/>
+    </w:p>
+    <w:p>
+      <w:pPr>
+        <w:pStyle w:val="ListParagraph"/>
+        <w:numPr>
+          <w:ilvl w:val="0"/>
+          <w:numId w:val="13"/>
+        </w:numPr>
+      </w:pPr>
+      <w:r>
+        <w:t xml:space="preserve">Nippon India ETF Nifty 50 </w:t>
+      </w:r>
+      <w:proofErr w:type="spellStart"/>
+      <w:r>
+        <w:t>BeES</w:t>
+      </w:r>
+      <w:proofErr w:type="spellEnd"/>
+    </w:p>
+    <w:p>
+      <w:pPr>
+        <w:pStyle w:val="ListParagraph"/>
+        <w:numPr>
+          <w:ilvl w:val="0"/>
+          <w:numId w:val="13"/>
+        </w:numPr>
+      </w:pPr>
+      <w:r>
+        <w:t>Motilal Oswal NASDAQ 100 ETF</w:t>
+      </w:r>
+    </w:p>
+    <w:p>
+      <w:pPr>
+        <w:pStyle w:val="ListParagraph"/>
+        <w:numPr>
+          <w:ilvl w:val="0"/>
+          <w:numId w:val="13"/>
+        </w:numPr>
+      </w:pPr>
+      <w:r>
+        <w:t>SBI Gold ETF</w:t>
+      </w:r>
+    </w:p>
+    <w:p>
+      <w:pPr>
+        <w:pStyle w:val="ListParagraph"/>
+        <w:numPr>
+          <w:ilvl w:val="0"/>
+          <w:numId w:val="13"/>
+        </w:numPr>
+      </w:pPr>
+      <w:r>
+        <w:t xml:space="preserve">Nippon India ETF Nifty 1D Rate Liquid </w:t>
+      </w:r>
+      <w:proofErr w:type="spellStart"/>
+      <w:r>
+        <w:t>BeES</w:t>
+      </w:r>
+      <w:proofErr w:type="spellEnd"/>
+    </w:p>
+    <w:p>
+      <w:pPr>
+        <w:pStyle w:val="ListParagraph"/>
+        <w:numPr>
+          <w:ilvl w:val="0"/>
+          <w:numId w:val="13"/>
+        </w:numPr>
+      </w:pPr>
+      <w:r>
+        <w:t>ICICI Prudential Nifty 50 ETF</w:t>
+      </w:r>
+    </w:p>
+    <w:p>
+      <w:pPr>
+        <w:pStyle w:val="ListParagraph"/>
+        <w:numPr>
+          <w:ilvl w:val="0"/>
+          <w:numId w:val="13"/>
+        </w:numPr>
+      </w:pPr>
+      <w:r>
+        <w:t>Kotak Gold ETF</w:t>
+      </w:r>
+    </w:p>
+    <w:p>
+      <w:pPr>
+        <w:pStyle w:val="ListParagraph"/>
+        <w:numPr>
+          <w:ilvl w:val="0"/>
+          <w:numId w:val="13"/>
+        </w:numPr>
+      </w:pPr>
+      <w:r>
+        <w:t>HDFC Gold Exchange Traded Fund</w:t>
+      </w:r>
+    </w:p>
+    <w:p>
+      <w:pPr>
+        <w:pStyle w:val="ListParagraph"/>
+        <w:numPr>
+          <w:ilvl w:val="0"/>
+          <w:numId w:val="13"/>
+        </w:numPr>
+      </w:pPr>
+      <w:r>
+        <w:t>ICICI Prudential Gold ETF</w:t>
+      </w:r>
+    </w:p>
+    <w:p>
+      <w:pPr>
+        <w:pStyle w:val="ListParagraph"/>
+        <w:numPr>
+          <w:ilvl w:val="0"/>
+          <w:numId w:val="13"/>
+        </w:numPr>
+      </w:pPr>
+      <w:r>
+        <w:t xml:space="preserve">Nippon India ETF Nifty Next 50 Junior </w:t>
+      </w:r>
+      <w:proofErr w:type="spellStart"/>
+      <w:r>
+        <w:t>BeES</w:t>
+      </w:r>
+      <w:proofErr w:type="spellEnd"/>
+    </w:p>
+    <w:p>
+      <w:pPr>
+        <w:pStyle w:val="ListParagraph"/>
+        <w:numPr>
+          <w:ilvl w:val="0"/>
+          <w:numId w:val="13"/>
+        </w:numPr>
+      </w:pPr>
+      <w:r>
+        <w:t>Kotak Nifty 50 ETF</w:t>
+      </w:r>
+    </w:p>
     <w:p>
       <w:pPr>
         <w:ind w:left="720"/>
@@ -2638,6 +3773,184 @@
 <file path=word/numbering.xml><?xml version="1.0" encoding="utf-8"?>
 <w:numbering xmlns:wpc="http://schemas.microsoft.com/office/word/2010/wordprocessingCanvas" xmlns:cx="http://schemas.microsoft.com/office/drawing/2014/chartex" xmlns:cx1="http://schemas.microsoft.com/office/drawing/2015/9/8/chartex" xmlns:cx2="http://schemas.microsoft.com/office/drawing/2015/10/21/chartex" xmlns:cx3="http://schemas.microsoft.com/office/drawing/2016/5/9/chartex" xmlns:cx4="http://schemas.microsoft.com/office/drawing/2016/5/10/chartex" xmlns:cx5="http://schemas.microsoft.com/office/drawing/2016/5/11/chartex" xmlns:cx6="http://schemas.microsoft.com/office/drawing/2016/5/12/chartex" xmlns:cx7="http://schemas.microsoft.com/office/drawing/2016/5/13/chartex" xmlns:cx8="http://schemas.microsoft.com/office/drawing/2016/5/14/chartex" xmlns:mc="http://schemas.openxmlformats.org/markup-compatibility/2006" xmlns:aink="http://schemas.microsoft.com/office/drawing/2016/ink" xmlns:am3d="http://schemas.microsoft.com/office/drawing/2017/model3d" xmlns:o="urn:schemas-microsoft-com:office:office" xmlns:oel="http://schemas.microsoft.com/office/2019/extlst" xmlns:r="http://schemas.openxmlformats.org/officeDocument/2006/relationships" xmlns:m="http://schemas.openxmlformats.org/officeDocument/2006/math" xmlns:v="urn:schemas-microsoft-com:vml" xmlns:wp14="http://schemas.microsoft.com/office/word/2010/wordprocessingDrawing" xmlns:wp="http://schemas.openxmlformats.org/drawingml/2006/wordprocessingDrawing" xmlns:w10="urn:schemas-microsoft-com:office:word" xmlns:w="http://schemas.openxmlformats.org/wordprocessingml/2006/main" xmlns:w14="http://schemas.microsoft.com/office/word/2010/wordml" xmlns:w15="http://schemas.microsoft.com/office/word/2012/wordml" xmlns:w16cex="http://schemas.microsoft.com/office/word/2018/wordml/cex" xmlns:w16cid="http://schemas.microsoft.com/office/word/2016/wordml/cid" xmlns:w16="http://schemas.microsoft.com/office/word/2018/wordml" xmlns:w16du="http://schemas.microsoft.com/office/word/2023/wordml/word16du" xmlns:w16sdtdh="http://schemas.microsoft.com/office/word/2020/wordml/sdtdatahash" xmlns:w16sdtfl="http://schemas.microsoft.com/office/word/2024/wordml/sdtformatlock" xmlns:w16se="http://schemas.microsoft.com/office/word/2015/wordml/symex" xmlns:wpg="http://schemas.microsoft.com/office/word/2010/wordprocessingGroup" xmlns:wpi="http://schemas.microsoft.com/office/word/2010/wordprocessingInk" xmlns:wne="http://schemas.microsoft.com/office/word/2006/wordml" xmlns:wps="http://schemas.microsoft.com/office/word/2010/wordprocessingShape" mc:Ignorable="w14 w15 w16se w16cid w16 w16cex w16sdtdh w16sdtfl w16du wp14">
   <w:abstractNum w:abstractNumId="0" w15:restartNumberingAfterBreak="0">
+    <w:nsid w:val="202C5F22"/>
+    <w:multiLevelType w:val="hybridMultilevel"/>
+    <w:tmpl w:val="233C3950"/>
+    <w:lvl w:ilvl="0" w:tplc="4009000F">
+      <w:start w:val="1"/>
+      <w:numFmt w:val="decimal"/>
+      <w:lvlText w:val="%1."/>
+      <w:lvlJc w:val="left"/>
+      <w:pPr>
+        <w:ind w:left="720" w:hanging="360"/>
+      </w:pPr>
+      <w:rPr>
+        <w:rFonts w:hint="default"/>
+      </w:rPr>
+    </w:lvl>
+    <w:lvl w:ilvl="1" w:tplc="40090019" w:tentative="1">
+      <w:start w:val="1"/>
+      <w:numFmt w:val="lowerLetter"/>
+      <w:lvlText w:val="%2."/>
+      <w:lvlJc w:val="left"/>
+      <w:pPr>
+        <w:ind w:left="1440" w:hanging="360"/>
+      </w:pPr>
+    </w:lvl>
+    <w:lvl w:ilvl="2" w:tplc="4009001B" w:tentative="1">
+      <w:start w:val="1"/>
+      <w:numFmt w:val="lowerRoman"/>
+      <w:lvlText w:val="%3."/>
+      <w:lvlJc w:val="right"/>
+      <w:pPr>
+        <w:ind w:left="2160" w:hanging="180"/>
+      </w:pPr>
+    </w:lvl>
+    <w:lvl w:ilvl="3" w:tplc="4009000F" w:tentative="1">
+      <w:start w:val="1"/>
+      <w:numFmt w:val="decimal"/>
+      <w:lvlText w:val="%4."/>
+      <w:lvlJc w:val="left"/>
+      <w:pPr>
+        <w:ind w:left="2880" w:hanging="360"/>
+      </w:pPr>
+    </w:lvl>
+    <w:lvl w:ilvl="4" w:tplc="40090019" w:tentative="1">
+      <w:start w:val="1"/>
+      <w:numFmt w:val="lowerLetter"/>
+      <w:lvlText w:val="%5."/>
+      <w:lvlJc w:val="left"/>
+      <w:pPr>
+        <w:ind w:left="3600" w:hanging="360"/>
+      </w:pPr>
+    </w:lvl>
+    <w:lvl w:ilvl="5" w:tplc="4009001B" w:tentative="1">
+      <w:start w:val="1"/>
+      <w:numFmt w:val="lowerRoman"/>
+      <w:lvlText w:val="%6."/>
+      <w:lvlJc w:val="right"/>
+      <w:pPr>
+        <w:ind w:left="4320" w:hanging="180"/>
+      </w:pPr>
+    </w:lvl>
+    <w:lvl w:ilvl="6" w:tplc="4009000F" w:tentative="1">
+      <w:start w:val="1"/>
+      <w:numFmt w:val="decimal"/>
+      <w:lvlText w:val="%7."/>
+      <w:lvlJc w:val="left"/>
+      <w:pPr>
+        <w:ind w:left="5040" w:hanging="360"/>
+      </w:pPr>
+    </w:lvl>
+    <w:lvl w:ilvl="7" w:tplc="40090019" w:tentative="1">
+      <w:start w:val="1"/>
+      <w:numFmt w:val="lowerLetter"/>
+      <w:lvlText w:val="%8."/>
+      <w:lvlJc w:val="left"/>
+      <w:pPr>
+        <w:ind w:left="5760" w:hanging="360"/>
+      </w:pPr>
+    </w:lvl>
+    <w:lvl w:ilvl="8" w:tplc="4009001B" w:tentative="1">
+      <w:start w:val="1"/>
+      <w:numFmt w:val="lowerRoman"/>
+      <w:lvlText w:val="%9."/>
+      <w:lvlJc w:val="right"/>
+      <w:pPr>
+        <w:ind w:left="6480" w:hanging="180"/>
+      </w:pPr>
+    </w:lvl>
+  </w:abstractNum>
+  <w:abstractNum w:abstractNumId="1" w15:restartNumberingAfterBreak="0">
+    <w:nsid w:val="2FB873C4"/>
+    <w:multiLevelType w:val="hybridMultilevel"/>
+    <w:tmpl w:val="56429124"/>
+    <w:lvl w:ilvl="0" w:tplc="4009000F">
+      <w:start w:val="1"/>
+      <w:numFmt w:val="decimal"/>
+      <w:lvlText w:val="%1."/>
+      <w:lvlJc w:val="left"/>
+      <w:pPr>
+        <w:ind w:left="720" w:hanging="360"/>
+      </w:pPr>
+      <w:rPr>
+        <w:rFonts w:hint="default"/>
+      </w:rPr>
+    </w:lvl>
+    <w:lvl w:ilvl="1" w:tplc="40090019" w:tentative="1">
+      <w:start w:val="1"/>
+      <w:numFmt w:val="lowerLetter"/>
+      <w:lvlText w:val="%2."/>
+      <w:lvlJc w:val="left"/>
+      <w:pPr>
+        <w:ind w:left="1440" w:hanging="360"/>
+      </w:pPr>
+    </w:lvl>
+    <w:lvl w:ilvl="2" w:tplc="4009001B" w:tentative="1">
+      <w:start w:val="1"/>
+      <w:numFmt w:val="lowerRoman"/>
+      <w:lvlText w:val="%3."/>
+      <w:lvlJc w:val="right"/>
+      <w:pPr>
+        <w:ind w:left="2160" w:hanging="180"/>
+      </w:pPr>
+    </w:lvl>
+    <w:lvl w:ilvl="3" w:tplc="4009000F" w:tentative="1">
+      <w:start w:val="1"/>
+      <w:numFmt w:val="decimal"/>
+      <w:lvlText w:val="%4."/>
+      <w:lvlJc w:val="left"/>
+      <w:pPr>
+        <w:ind w:left="2880" w:hanging="360"/>
+      </w:pPr>
+    </w:lvl>
+    <w:lvl w:ilvl="4" w:tplc="40090019" w:tentative="1">
+      <w:start w:val="1"/>
+      <w:numFmt w:val="lowerLetter"/>
+      <w:lvlText w:val="%5."/>
+      <w:lvlJc w:val="left"/>
+      <w:pPr>
+        <w:ind w:left="3600" w:hanging="360"/>
+      </w:pPr>
+    </w:lvl>
+    <w:lvl w:ilvl="5" w:tplc="4009001B" w:tentative="1">
+      <w:start w:val="1"/>
+      <w:numFmt w:val="lowerRoman"/>
+      <w:lvlText w:val="%6."/>
+      <w:lvlJc w:val="right"/>
+      <w:pPr>
+        <w:ind w:left="4320" w:hanging="180"/>
+      </w:pPr>
+    </w:lvl>
+    <w:lvl w:ilvl="6" w:tplc="4009000F" w:tentative="1">
+      <w:start w:val="1"/>
+      <w:numFmt w:val="decimal"/>
+      <w:lvlText w:val="%7."/>
+      <w:lvlJc w:val="left"/>
+      <w:pPr>
+        <w:ind w:left="5040" w:hanging="360"/>
+      </w:pPr>
+    </w:lvl>
+    <w:lvl w:ilvl="7" w:tplc="40090019" w:tentative="1">
+      <w:start w:val="1"/>
+      <w:numFmt w:val="lowerLetter"/>
+      <w:lvlText w:val="%8."/>
+      <w:lvlJc w:val="left"/>
+      <w:pPr>
+        <w:ind w:left="5760" w:hanging="360"/>
+      </w:pPr>
+    </w:lvl>
+    <w:lvl w:ilvl="8" w:tplc="4009001B" w:tentative="1">
+      <w:start w:val="1"/>
+      <w:numFmt w:val="lowerRoman"/>
+      <w:lvlText w:val="%9."/>
+      <w:lvlJc w:val="right"/>
+      <w:pPr>
+        <w:ind w:left="6480" w:hanging="180"/>
+      </w:pPr>
+    </w:lvl>
+  </w:abstractNum>
+  <w:abstractNum w:abstractNumId="2" w15:restartNumberingAfterBreak="0">
     <w:nsid w:val="321C0F8F"/>
     <w:multiLevelType w:val="hybridMultilevel"/>
     <w:tmpl w:val="308E0B98"/>
@@ -2723,7 +4036,452 @@
       </w:pPr>
     </w:lvl>
   </w:abstractNum>
-  <w:abstractNum w:abstractNumId="1" w15:restartNumberingAfterBreak="0">
+  <w:abstractNum w:abstractNumId="3" w15:restartNumberingAfterBreak="0">
+    <w:nsid w:val="442B63ED"/>
+    <w:multiLevelType w:val="hybridMultilevel"/>
+    <w:tmpl w:val="83FA8794"/>
+    <w:lvl w:ilvl="0" w:tplc="4009000F">
+      <w:start w:val="1"/>
+      <w:numFmt w:val="decimal"/>
+      <w:lvlText w:val="%1."/>
+      <w:lvlJc w:val="left"/>
+      <w:pPr>
+        <w:ind w:left="720" w:hanging="360"/>
+      </w:pPr>
+      <w:rPr>
+        <w:rFonts w:hint="default"/>
+      </w:rPr>
+    </w:lvl>
+    <w:lvl w:ilvl="1" w:tplc="40090019" w:tentative="1">
+      <w:start w:val="1"/>
+      <w:numFmt w:val="lowerLetter"/>
+      <w:lvlText w:val="%2."/>
+      <w:lvlJc w:val="left"/>
+      <w:pPr>
+        <w:ind w:left="1440" w:hanging="360"/>
+      </w:pPr>
+    </w:lvl>
+    <w:lvl w:ilvl="2" w:tplc="4009001B" w:tentative="1">
+      <w:start w:val="1"/>
+      <w:numFmt w:val="lowerRoman"/>
+      <w:lvlText w:val="%3."/>
+      <w:lvlJc w:val="right"/>
+      <w:pPr>
+        <w:ind w:left="2160" w:hanging="180"/>
+      </w:pPr>
+    </w:lvl>
+    <w:lvl w:ilvl="3" w:tplc="4009000F" w:tentative="1">
+      <w:start w:val="1"/>
+      <w:numFmt w:val="decimal"/>
+      <w:lvlText w:val="%4."/>
+      <w:lvlJc w:val="left"/>
+      <w:pPr>
+        <w:ind w:left="2880" w:hanging="360"/>
+      </w:pPr>
+    </w:lvl>
+    <w:lvl w:ilvl="4" w:tplc="40090019" w:tentative="1">
+      <w:start w:val="1"/>
+      <w:numFmt w:val="lowerLetter"/>
+      <w:lvlText w:val="%5."/>
+      <w:lvlJc w:val="left"/>
+      <w:pPr>
+        <w:ind w:left="3600" w:hanging="360"/>
+      </w:pPr>
+    </w:lvl>
+    <w:lvl w:ilvl="5" w:tplc="4009001B" w:tentative="1">
+      <w:start w:val="1"/>
+      <w:numFmt w:val="lowerRoman"/>
+      <w:lvlText w:val="%6."/>
+      <w:lvlJc w:val="right"/>
+      <w:pPr>
+        <w:ind w:left="4320" w:hanging="180"/>
+      </w:pPr>
+    </w:lvl>
+    <w:lvl w:ilvl="6" w:tplc="4009000F" w:tentative="1">
+      <w:start w:val="1"/>
+      <w:numFmt w:val="decimal"/>
+      <w:lvlText w:val="%7."/>
+      <w:lvlJc w:val="left"/>
+      <w:pPr>
+        <w:ind w:left="5040" w:hanging="360"/>
+      </w:pPr>
+    </w:lvl>
+    <w:lvl w:ilvl="7" w:tplc="40090019" w:tentative="1">
+      <w:start w:val="1"/>
+      <w:numFmt w:val="lowerLetter"/>
+      <w:lvlText w:val="%8."/>
+      <w:lvlJc w:val="left"/>
+      <w:pPr>
+        <w:ind w:left="5760" w:hanging="360"/>
+      </w:pPr>
+    </w:lvl>
+    <w:lvl w:ilvl="8" w:tplc="4009001B" w:tentative="1">
+      <w:start w:val="1"/>
+      <w:numFmt w:val="lowerRoman"/>
+      <w:lvlText w:val="%9."/>
+      <w:lvlJc w:val="right"/>
+      <w:pPr>
+        <w:ind w:left="6480" w:hanging="180"/>
+      </w:pPr>
+    </w:lvl>
+  </w:abstractNum>
+  <w:abstractNum w:abstractNumId="4" w15:restartNumberingAfterBreak="0">
+    <w:nsid w:val="45464B4D"/>
+    <w:multiLevelType w:val="hybridMultilevel"/>
+    <w:tmpl w:val="F51A672A"/>
+    <w:lvl w:ilvl="0" w:tplc="4009000F">
+      <w:start w:val="1"/>
+      <w:numFmt w:val="decimal"/>
+      <w:lvlText w:val="%1."/>
+      <w:lvlJc w:val="left"/>
+      <w:pPr>
+        <w:ind w:left="720" w:hanging="360"/>
+      </w:pPr>
+      <w:rPr>
+        <w:rFonts w:hint="default"/>
+      </w:rPr>
+    </w:lvl>
+    <w:lvl w:ilvl="1" w:tplc="40090019" w:tentative="1">
+      <w:start w:val="1"/>
+      <w:numFmt w:val="lowerLetter"/>
+      <w:lvlText w:val="%2."/>
+      <w:lvlJc w:val="left"/>
+      <w:pPr>
+        <w:ind w:left="1440" w:hanging="360"/>
+      </w:pPr>
+    </w:lvl>
+    <w:lvl w:ilvl="2" w:tplc="4009001B" w:tentative="1">
+      <w:start w:val="1"/>
+      <w:numFmt w:val="lowerRoman"/>
+      <w:lvlText w:val="%3."/>
+      <w:lvlJc w:val="right"/>
+      <w:pPr>
+        <w:ind w:left="2160" w:hanging="180"/>
+      </w:pPr>
+    </w:lvl>
+    <w:lvl w:ilvl="3" w:tplc="4009000F" w:tentative="1">
+      <w:start w:val="1"/>
+      <w:numFmt w:val="decimal"/>
+      <w:lvlText w:val="%4."/>
+      <w:lvlJc w:val="left"/>
+      <w:pPr>
+        <w:ind w:left="2880" w:hanging="360"/>
+      </w:pPr>
+    </w:lvl>
+    <w:lvl w:ilvl="4" w:tplc="40090019" w:tentative="1">
+      <w:start w:val="1"/>
+      <w:numFmt w:val="lowerLetter"/>
+      <w:lvlText w:val="%5."/>
+      <w:lvlJc w:val="left"/>
+      <w:pPr>
+        <w:ind w:left="3600" w:hanging="360"/>
+      </w:pPr>
+    </w:lvl>
+    <w:lvl w:ilvl="5" w:tplc="4009001B" w:tentative="1">
+      <w:start w:val="1"/>
+      <w:numFmt w:val="lowerRoman"/>
+      <w:lvlText w:val="%6."/>
+      <w:lvlJc w:val="right"/>
+      <w:pPr>
+        <w:ind w:left="4320" w:hanging="180"/>
+      </w:pPr>
+    </w:lvl>
+    <w:lvl w:ilvl="6" w:tplc="4009000F" w:tentative="1">
+      <w:start w:val="1"/>
+      <w:numFmt w:val="decimal"/>
+      <w:lvlText w:val="%7."/>
+      <w:lvlJc w:val="left"/>
+      <w:pPr>
+        <w:ind w:left="5040" w:hanging="360"/>
+      </w:pPr>
+    </w:lvl>
+    <w:lvl w:ilvl="7" w:tplc="40090019" w:tentative="1">
+      <w:start w:val="1"/>
+      <w:numFmt w:val="lowerLetter"/>
+      <w:lvlText w:val="%8."/>
+      <w:lvlJc w:val="left"/>
+      <w:pPr>
+        <w:ind w:left="5760" w:hanging="360"/>
+      </w:pPr>
+    </w:lvl>
+    <w:lvl w:ilvl="8" w:tplc="4009001B" w:tentative="1">
+      <w:start w:val="1"/>
+      <w:numFmt w:val="lowerRoman"/>
+      <w:lvlText w:val="%9."/>
+      <w:lvlJc w:val="right"/>
+      <w:pPr>
+        <w:ind w:left="6480" w:hanging="180"/>
+      </w:pPr>
+    </w:lvl>
+  </w:abstractNum>
+  <w:abstractNum w:abstractNumId="5" w15:restartNumberingAfterBreak="0">
+    <w:nsid w:val="490621BF"/>
+    <w:multiLevelType w:val="hybridMultilevel"/>
+    <w:tmpl w:val="405A069E"/>
+    <w:lvl w:ilvl="0" w:tplc="4009000F">
+      <w:start w:val="1"/>
+      <w:numFmt w:val="decimal"/>
+      <w:lvlText w:val="%1."/>
+      <w:lvlJc w:val="left"/>
+      <w:pPr>
+        <w:ind w:left="720" w:hanging="360"/>
+      </w:pPr>
+      <w:rPr>
+        <w:rFonts w:hint="default"/>
+      </w:rPr>
+    </w:lvl>
+    <w:lvl w:ilvl="1" w:tplc="40090019" w:tentative="1">
+      <w:start w:val="1"/>
+      <w:numFmt w:val="lowerLetter"/>
+      <w:lvlText w:val="%2."/>
+      <w:lvlJc w:val="left"/>
+      <w:pPr>
+        <w:ind w:left="1440" w:hanging="360"/>
+      </w:pPr>
+    </w:lvl>
+    <w:lvl w:ilvl="2" w:tplc="4009001B" w:tentative="1">
+      <w:start w:val="1"/>
+      <w:numFmt w:val="lowerRoman"/>
+      <w:lvlText w:val="%3."/>
+      <w:lvlJc w:val="right"/>
+      <w:pPr>
+        <w:ind w:left="2160" w:hanging="180"/>
+      </w:pPr>
+    </w:lvl>
+    <w:lvl w:ilvl="3" w:tplc="4009000F" w:tentative="1">
+      <w:start w:val="1"/>
+      <w:numFmt w:val="decimal"/>
+      <w:lvlText w:val="%4."/>
+      <w:lvlJc w:val="left"/>
+      <w:pPr>
+        <w:ind w:left="2880" w:hanging="360"/>
+      </w:pPr>
+    </w:lvl>
+    <w:lvl w:ilvl="4" w:tplc="40090019" w:tentative="1">
+      <w:start w:val="1"/>
+      <w:numFmt w:val="lowerLetter"/>
+      <w:lvlText w:val="%5."/>
+      <w:lvlJc w:val="left"/>
+      <w:pPr>
+        <w:ind w:left="3600" w:hanging="360"/>
+      </w:pPr>
+    </w:lvl>
+    <w:lvl w:ilvl="5" w:tplc="4009001B" w:tentative="1">
+      <w:start w:val="1"/>
+      <w:numFmt w:val="lowerRoman"/>
+      <w:lvlText w:val="%6."/>
+      <w:lvlJc w:val="right"/>
+      <w:pPr>
+        <w:ind w:left="4320" w:hanging="180"/>
+      </w:pPr>
+    </w:lvl>
+    <w:lvl w:ilvl="6" w:tplc="4009000F" w:tentative="1">
+      <w:start w:val="1"/>
+      <w:numFmt w:val="decimal"/>
+      <w:lvlText w:val="%7."/>
+      <w:lvlJc w:val="left"/>
+      <w:pPr>
+        <w:ind w:left="5040" w:hanging="360"/>
+      </w:pPr>
+    </w:lvl>
+    <w:lvl w:ilvl="7" w:tplc="40090019" w:tentative="1">
+      <w:start w:val="1"/>
+      <w:numFmt w:val="lowerLetter"/>
+      <w:lvlText w:val="%8."/>
+      <w:lvlJc w:val="left"/>
+      <w:pPr>
+        <w:ind w:left="5760" w:hanging="360"/>
+      </w:pPr>
+    </w:lvl>
+    <w:lvl w:ilvl="8" w:tplc="4009001B" w:tentative="1">
+      <w:start w:val="1"/>
+      <w:numFmt w:val="lowerRoman"/>
+      <w:lvlText w:val="%9."/>
+      <w:lvlJc w:val="right"/>
+      <w:pPr>
+        <w:ind w:left="6480" w:hanging="180"/>
+      </w:pPr>
+    </w:lvl>
+  </w:abstractNum>
+  <w:abstractNum w:abstractNumId="6" w15:restartNumberingAfterBreak="0">
+    <w:nsid w:val="4951672E"/>
+    <w:multiLevelType w:val="hybridMultilevel"/>
+    <w:tmpl w:val="FBA0F722"/>
+    <w:lvl w:ilvl="0" w:tplc="4009000F">
+      <w:start w:val="1"/>
+      <w:numFmt w:val="decimal"/>
+      <w:lvlText w:val="%1."/>
+      <w:lvlJc w:val="left"/>
+      <w:pPr>
+        <w:ind w:left="720" w:hanging="360"/>
+      </w:pPr>
+      <w:rPr>
+        <w:rFonts w:hint="default"/>
+      </w:rPr>
+    </w:lvl>
+    <w:lvl w:ilvl="1" w:tplc="40090019" w:tentative="1">
+      <w:start w:val="1"/>
+      <w:numFmt w:val="lowerLetter"/>
+      <w:lvlText w:val="%2."/>
+      <w:lvlJc w:val="left"/>
+      <w:pPr>
+        <w:ind w:left="1440" w:hanging="360"/>
+      </w:pPr>
+    </w:lvl>
+    <w:lvl w:ilvl="2" w:tplc="4009001B" w:tentative="1">
+      <w:start w:val="1"/>
+      <w:numFmt w:val="lowerRoman"/>
+      <w:lvlText w:val="%3."/>
+      <w:lvlJc w:val="right"/>
+      <w:pPr>
+        <w:ind w:left="2160" w:hanging="180"/>
+      </w:pPr>
+    </w:lvl>
+    <w:lvl w:ilvl="3" w:tplc="4009000F" w:tentative="1">
+      <w:start w:val="1"/>
+      <w:numFmt w:val="decimal"/>
+      <w:lvlText w:val="%4."/>
+      <w:lvlJc w:val="left"/>
+      <w:pPr>
+        <w:ind w:left="2880" w:hanging="360"/>
+      </w:pPr>
+    </w:lvl>
+    <w:lvl w:ilvl="4" w:tplc="40090019" w:tentative="1">
+      <w:start w:val="1"/>
+      <w:numFmt w:val="lowerLetter"/>
+      <w:lvlText w:val="%5."/>
+      <w:lvlJc w:val="left"/>
+      <w:pPr>
+        <w:ind w:left="3600" w:hanging="360"/>
+      </w:pPr>
+    </w:lvl>
+    <w:lvl w:ilvl="5" w:tplc="4009001B" w:tentative="1">
+      <w:start w:val="1"/>
+      <w:numFmt w:val="lowerRoman"/>
+      <w:lvlText w:val="%6."/>
+      <w:lvlJc w:val="right"/>
+      <w:pPr>
+        <w:ind w:left="4320" w:hanging="180"/>
+      </w:pPr>
+    </w:lvl>
+    <w:lvl w:ilvl="6" w:tplc="4009000F" w:tentative="1">
+      <w:start w:val="1"/>
+      <w:numFmt w:val="decimal"/>
+      <w:lvlText w:val="%7."/>
+      <w:lvlJc w:val="left"/>
+      <w:pPr>
+        <w:ind w:left="5040" w:hanging="360"/>
+      </w:pPr>
+    </w:lvl>
+    <w:lvl w:ilvl="7" w:tplc="40090019" w:tentative="1">
+      <w:start w:val="1"/>
+      <w:numFmt w:val="lowerLetter"/>
+      <w:lvlText w:val="%8."/>
+      <w:lvlJc w:val="left"/>
+      <w:pPr>
+        <w:ind w:left="5760" w:hanging="360"/>
+      </w:pPr>
+    </w:lvl>
+    <w:lvl w:ilvl="8" w:tplc="4009001B" w:tentative="1">
+      <w:start w:val="1"/>
+      <w:numFmt w:val="lowerRoman"/>
+      <w:lvlText w:val="%9."/>
+      <w:lvlJc w:val="right"/>
+      <w:pPr>
+        <w:ind w:left="6480" w:hanging="180"/>
+      </w:pPr>
+    </w:lvl>
+  </w:abstractNum>
+  <w:abstractNum w:abstractNumId="7" w15:restartNumberingAfterBreak="0">
+    <w:nsid w:val="49AF0EE9"/>
+    <w:multiLevelType w:val="hybridMultilevel"/>
+    <w:tmpl w:val="56429124"/>
+    <w:lvl w:ilvl="0" w:tplc="FFFFFFFF">
+      <w:start w:val="1"/>
+      <w:numFmt w:val="decimal"/>
+      <w:lvlText w:val="%1."/>
+      <w:lvlJc w:val="left"/>
+      <w:pPr>
+        <w:ind w:left="720" w:hanging="360"/>
+      </w:pPr>
+      <w:rPr>
+        <w:rFonts w:hint="default"/>
+      </w:rPr>
+    </w:lvl>
+    <w:lvl w:ilvl="1" w:tplc="FFFFFFFF" w:tentative="1">
+      <w:start w:val="1"/>
+      <w:numFmt w:val="lowerLetter"/>
+      <w:lvlText w:val="%2."/>
+      <w:lvlJc w:val="left"/>
+      <w:pPr>
+        <w:ind w:left="1440" w:hanging="360"/>
+      </w:pPr>
+    </w:lvl>
+    <w:lvl w:ilvl="2" w:tplc="FFFFFFFF" w:tentative="1">
+      <w:start w:val="1"/>
+      <w:numFmt w:val="lowerRoman"/>
+      <w:lvlText w:val="%3."/>
+      <w:lvlJc w:val="right"/>
+      <w:pPr>
+        <w:ind w:left="2160" w:hanging="180"/>
+      </w:pPr>
+    </w:lvl>
+    <w:lvl w:ilvl="3" w:tplc="FFFFFFFF" w:tentative="1">
+      <w:start w:val="1"/>
+      <w:numFmt w:val="decimal"/>
+      <w:lvlText w:val="%4."/>
+      <w:lvlJc w:val="left"/>
+      <w:pPr>
+        <w:ind w:left="2880" w:hanging="360"/>
+      </w:pPr>
+    </w:lvl>
+    <w:lvl w:ilvl="4" w:tplc="FFFFFFFF" w:tentative="1">
+      <w:start w:val="1"/>
+      <w:numFmt w:val="lowerLetter"/>
+      <w:lvlText w:val="%5."/>
+      <w:lvlJc w:val="left"/>
+      <w:pPr>
+        <w:ind w:left="3600" w:hanging="360"/>
+      </w:pPr>
+    </w:lvl>
+    <w:lvl w:ilvl="5" w:tplc="FFFFFFFF" w:tentative="1">
+      <w:start w:val="1"/>
+      <w:numFmt w:val="lowerRoman"/>
+      <w:lvlText w:val="%6."/>
+      <w:lvlJc w:val="right"/>
+      <w:pPr>
+        <w:ind w:left="4320" w:hanging="180"/>
+      </w:pPr>
+    </w:lvl>
+    <w:lvl w:ilvl="6" w:tplc="FFFFFFFF" w:tentative="1">
+      <w:start w:val="1"/>
+      <w:numFmt w:val="decimal"/>
+      <w:lvlText w:val="%7."/>
+      <w:lvlJc w:val="left"/>
+      <w:pPr>
+        <w:ind w:left="5040" w:hanging="360"/>
+      </w:pPr>
+    </w:lvl>
+    <w:lvl w:ilvl="7" w:tplc="FFFFFFFF" w:tentative="1">
+      <w:start w:val="1"/>
+      <w:numFmt w:val="lowerLetter"/>
+      <w:lvlText w:val="%8."/>
+      <w:lvlJc w:val="left"/>
+      <w:pPr>
+        <w:ind w:left="5760" w:hanging="360"/>
+      </w:pPr>
+    </w:lvl>
+    <w:lvl w:ilvl="8" w:tplc="FFFFFFFF" w:tentative="1">
+      <w:start w:val="1"/>
+      <w:numFmt w:val="lowerRoman"/>
+      <w:lvlText w:val="%9."/>
+      <w:lvlJc w:val="right"/>
+      <w:pPr>
+        <w:ind w:left="6480" w:hanging="180"/>
+      </w:pPr>
+    </w:lvl>
+  </w:abstractNum>
+  <w:abstractNum w:abstractNumId="8" w15:restartNumberingAfterBreak="0">
     <w:nsid w:val="4BFD7327"/>
     <w:multiLevelType w:val="hybridMultilevel"/>
     <w:tmpl w:val="7854AC3E"/>
@@ -2812,7 +4570,7 @@
       </w:pPr>
     </w:lvl>
   </w:abstractNum>
-  <w:abstractNum w:abstractNumId="2" w15:restartNumberingAfterBreak="0">
+  <w:abstractNum w:abstractNumId="9" w15:restartNumberingAfterBreak="0">
     <w:nsid w:val="785E046C"/>
     <w:multiLevelType w:val="hybridMultilevel"/>
     <w:tmpl w:val="E384D288"/>
@@ -2898,14 +4656,311 @@
       </w:pPr>
     </w:lvl>
   </w:abstractNum>
+  <w:abstractNum w:abstractNumId="10" w15:restartNumberingAfterBreak="0">
+    <w:nsid w:val="7E0308FF"/>
+    <w:multiLevelType w:val="hybridMultilevel"/>
+    <w:tmpl w:val="E8F0FD5A"/>
+    <w:lvl w:ilvl="0" w:tplc="4009000F">
+      <w:start w:val="1"/>
+      <w:numFmt w:val="decimal"/>
+      <w:lvlText w:val="%1."/>
+      <w:lvlJc w:val="left"/>
+      <w:pPr>
+        <w:ind w:left="720" w:hanging="360"/>
+      </w:pPr>
+      <w:rPr>
+        <w:rFonts w:hint="default"/>
+      </w:rPr>
+    </w:lvl>
+    <w:lvl w:ilvl="1" w:tplc="40090019" w:tentative="1">
+      <w:start w:val="1"/>
+      <w:numFmt w:val="lowerLetter"/>
+      <w:lvlText w:val="%2."/>
+      <w:lvlJc w:val="left"/>
+      <w:pPr>
+        <w:ind w:left="1440" w:hanging="360"/>
+      </w:pPr>
+    </w:lvl>
+    <w:lvl w:ilvl="2" w:tplc="4009001B" w:tentative="1">
+      <w:start w:val="1"/>
+      <w:numFmt w:val="lowerRoman"/>
+      <w:lvlText w:val="%3."/>
+      <w:lvlJc w:val="right"/>
+      <w:pPr>
+        <w:ind w:left="2160" w:hanging="180"/>
+      </w:pPr>
+    </w:lvl>
+    <w:lvl w:ilvl="3" w:tplc="4009000F" w:tentative="1">
+      <w:start w:val="1"/>
+      <w:numFmt w:val="decimal"/>
+      <w:lvlText w:val="%4."/>
+      <w:lvlJc w:val="left"/>
+      <w:pPr>
+        <w:ind w:left="2880" w:hanging="360"/>
+      </w:pPr>
+    </w:lvl>
+    <w:lvl w:ilvl="4" w:tplc="40090019" w:tentative="1">
+      <w:start w:val="1"/>
+      <w:numFmt w:val="lowerLetter"/>
+      <w:lvlText w:val="%5."/>
+      <w:lvlJc w:val="left"/>
+      <w:pPr>
+        <w:ind w:left="3600" w:hanging="360"/>
+      </w:pPr>
+    </w:lvl>
+    <w:lvl w:ilvl="5" w:tplc="4009001B" w:tentative="1">
+      <w:start w:val="1"/>
+      <w:numFmt w:val="lowerRoman"/>
+      <w:lvlText w:val="%6."/>
+      <w:lvlJc w:val="right"/>
+      <w:pPr>
+        <w:ind w:left="4320" w:hanging="180"/>
+      </w:pPr>
+    </w:lvl>
+    <w:lvl w:ilvl="6" w:tplc="4009000F" w:tentative="1">
+      <w:start w:val="1"/>
+      <w:numFmt w:val="decimal"/>
+      <w:lvlText w:val="%7."/>
+      <w:lvlJc w:val="left"/>
+      <w:pPr>
+        <w:ind w:left="5040" w:hanging="360"/>
+      </w:pPr>
+    </w:lvl>
+    <w:lvl w:ilvl="7" w:tplc="40090019" w:tentative="1">
+      <w:start w:val="1"/>
+      <w:numFmt w:val="lowerLetter"/>
+      <w:lvlText w:val="%8."/>
+      <w:lvlJc w:val="left"/>
+      <w:pPr>
+        <w:ind w:left="5760" w:hanging="360"/>
+      </w:pPr>
+    </w:lvl>
+    <w:lvl w:ilvl="8" w:tplc="4009001B" w:tentative="1">
+      <w:start w:val="1"/>
+      <w:numFmt w:val="lowerRoman"/>
+      <w:lvlText w:val="%9."/>
+      <w:lvlJc w:val="right"/>
+      <w:pPr>
+        <w:ind w:left="6480" w:hanging="180"/>
+      </w:pPr>
+    </w:lvl>
+  </w:abstractNum>
+  <w:abstractNum w:abstractNumId="11" w15:restartNumberingAfterBreak="0">
+    <w:nsid w:val="7F7C1F53"/>
+    <w:multiLevelType w:val="hybridMultilevel"/>
+    <w:tmpl w:val="56F2F434"/>
+    <w:lvl w:ilvl="0" w:tplc="4009000F">
+      <w:start w:val="1"/>
+      <w:numFmt w:val="decimal"/>
+      <w:lvlText w:val="%1."/>
+      <w:lvlJc w:val="left"/>
+      <w:pPr>
+        <w:ind w:left="720" w:hanging="360"/>
+      </w:pPr>
+      <w:rPr>
+        <w:rFonts w:hint="default"/>
+      </w:rPr>
+    </w:lvl>
+    <w:lvl w:ilvl="1" w:tplc="40090019" w:tentative="1">
+      <w:start w:val="1"/>
+      <w:numFmt w:val="lowerLetter"/>
+      <w:lvlText w:val="%2."/>
+      <w:lvlJc w:val="left"/>
+      <w:pPr>
+        <w:ind w:left="1440" w:hanging="360"/>
+      </w:pPr>
+    </w:lvl>
+    <w:lvl w:ilvl="2" w:tplc="4009001B" w:tentative="1">
+      <w:start w:val="1"/>
+      <w:numFmt w:val="lowerRoman"/>
+      <w:lvlText w:val="%3."/>
+      <w:lvlJc w:val="right"/>
+      <w:pPr>
+        <w:ind w:left="2160" w:hanging="180"/>
+      </w:pPr>
+    </w:lvl>
+    <w:lvl w:ilvl="3" w:tplc="4009000F" w:tentative="1">
+      <w:start w:val="1"/>
+      <w:numFmt w:val="decimal"/>
+      <w:lvlText w:val="%4."/>
+      <w:lvlJc w:val="left"/>
+      <w:pPr>
+        <w:ind w:left="2880" w:hanging="360"/>
+      </w:pPr>
+    </w:lvl>
+    <w:lvl w:ilvl="4" w:tplc="40090019" w:tentative="1">
+      <w:start w:val="1"/>
+      <w:numFmt w:val="lowerLetter"/>
+      <w:lvlText w:val="%5."/>
+      <w:lvlJc w:val="left"/>
+      <w:pPr>
+        <w:ind w:left="3600" w:hanging="360"/>
+      </w:pPr>
+    </w:lvl>
+    <w:lvl w:ilvl="5" w:tplc="4009001B" w:tentative="1">
+      <w:start w:val="1"/>
+      <w:numFmt w:val="lowerRoman"/>
+      <w:lvlText w:val="%6."/>
+      <w:lvlJc w:val="right"/>
+      <w:pPr>
+        <w:ind w:left="4320" w:hanging="180"/>
+      </w:pPr>
+    </w:lvl>
+    <w:lvl w:ilvl="6" w:tplc="4009000F" w:tentative="1">
+      <w:start w:val="1"/>
+      <w:numFmt w:val="decimal"/>
+      <w:lvlText w:val="%7."/>
+      <w:lvlJc w:val="left"/>
+      <w:pPr>
+        <w:ind w:left="5040" w:hanging="360"/>
+      </w:pPr>
+    </w:lvl>
+    <w:lvl w:ilvl="7" w:tplc="40090019" w:tentative="1">
+      <w:start w:val="1"/>
+      <w:numFmt w:val="lowerLetter"/>
+      <w:lvlText w:val="%8."/>
+      <w:lvlJc w:val="left"/>
+      <w:pPr>
+        <w:ind w:left="5760" w:hanging="360"/>
+      </w:pPr>
+    </w:lvl>
+    <w:lvl w:ilvl="8" w:tplc="4009001B" w:tentative="1">
+      <w:start w:val="1"/>
+      <w:numFmt w:val="lowerRoman"/>
+      <w:lvlText w:val="%9."/>
+      <w:lvlJc w:val="right"/>
+      <w:pPr>
+        <w:ind w:left="6480" w:hanging="180"/>
+      </w:pPr>
+    </w:lvl>
+  </w:abstractNum>
+  <w:abstractNum w:abstractNumId="12" w15:restartNumberingAfterBreak="0">
+    <w:nsid w:val="7FC91C98"/>
+    <w:multiLevelType w:val="hybridMultilevel"/>
+    <w:tmpl w:val="44D02ECA"/>
+    <w:lvl w:ilvl="0" w:tplc="4009000F">
+      <w:start w:val="1"/>
+      <w:numFmt w:val="decimal"/>
+      <w:lvlText w:val="%1."/>
+      <w:lvlJc w:val="left"/>
+      <w:pPr>
+        <w:ind w:left="720" w:hanging="360"/>
+      </w:pPr>
+      <w:rPr>
+        <w:rFonts w:hint="default"/>
+      </w:rPr>
+    </w:lvl>
+    <w:lvl w:ilvl="1" w:tplc="40090019" w:tentative="1">
+      <w:start w:val="1"/>
+      <w:numFmt w:val="lowerLetter"/>
+      <w:lvlText w:val="%2."/>
+      <w:lvlJc w:val="left"/>
+      <w:pPr>
+        <w:ind w:left="1440" w:hanging="360"/>
+      </w:pPr>
+    </w:lvl>
+    <w:lvl w:ilvl="2" w:tplc="4009001B" w:tentative="1">
+      <w:start w:val="1"/>
+      <w:numFmt w:val="lowerRoman"/>
+      <w:lvlText w:val="%3."/>
+      <w:lvlJc w:val="right"/>
+      <w:pPr>
+        <w:ind w:left="2160" w:hanging="180"/>
+      </w:pPr>
+    </w:lvl>
+    <w:lvl w:ilvl="3" w:tplc="4009000F" w:tentative="1">
+      <w:start w:val="1"/>
+      <w:numFmt w:val="decimal"/>
+      <w:lvlText w:val="%4."/>
+      <w:lvlJc w:val="left"/>
+      <w:pPr>
+        <w:ind w:left="2880" w:hanging="360"/>
+      </w:pPr>
+    </w:lvl>
+    <w:lvl w:ilvl="4" w:tplc="40090019" w:tentative="1">
+      <w:start w:val="1"/>
+      <w:numFmt w:val="lowerLetter"/>
+      <w:lvlText w:val="%5."/>
+      <w:lvlJc w:val="left"/>
+      <w:pPr>
+        <w:ind w:left="3600" w:hanging="360"/>
+      </w:pPr>
+    </w:lvl>
+    <w:lvl w:ilvl="5" w:tplc="4009001B" w:tentative="1">
+      <w:start w:val="1"/>
+      <w:numFmt w:val="lowerRoman"/>
+      <w:lvlText w:val="%6."/>
+      <w:lvlJc w:val="right"/>
+      <w:pPr>
+        <w:ind w:left="4320" w:hanging="180"/>
+      </w:pPr>
+    </w:lvl>
+    <w:lvl w:ilvl="6" w:tplc="4009000F" w:tentative="1">
+      <w:start w:val="1"/>
+      <w:numFmt w:val="decimal"/>
+      <w:lvlText w:val="%7."/>
+      <w:lvlJc w:val="left"/>
+      <w:pPr>
+        <w:ind w:left="5040" w:hanging="360"/>
+      </w:pPr>
+    </w:lvl>
+    <w:lvl w:ilvl="7" w:tplc="40090019" w:tentative="1">
+      <w:start w:val="1"/>
+      <w:numFmt w:val="lowerLetter"/>
+      <w:lvlText w:val="%8."/>
+      <w:lvlJc w:val="left"/>
+      <w:pPr>
+        <w:ind w:left="5760" w:hanging="360"/>
+      </w:pPr>
+    </w:lvl>
+    <w:lvl w:ilvl="8" w:tplc="4009001B" w:tentative="1">
+      <w:start w:val="1"/>
+      <w:numFmt w:val="lowerRoman"/>
+      <w:lvlText w:val="%9."/>
+      <w:lvlJc w:val="right"/>
+      <w:pPr>
+        <w:ind w:left="6480" w:hanging="180"/>
+      </w:pPr>
+    </w:lvl>
+  </w:abstractNum>
   <w:num w:numId="1" w16cid:durableId="1483816371">
+    <w:abstractNumId w:val="8"/>
+  </w:num>
+  <w:num w:numId="2" w16cid:durableId="732389108">
+    <w:abstractNumId w:val="9"/>
+  </w:num>
+  <w:num w:numId="3" w16cid:durableId="324170033">
+    <w:abstractNumId w:val="2"/>
+  </w:num>
+  <w:num w:numId="4" w16cid:durableId="1703549333">
+    <w:abstractNumId w:val="12"/>
+  </w:num>
+  <w:num w:numId="5" w16cid:durableId="538014444">
+    <w:abstractNumId w:val="0"/>
+  </w:num>
+  <w:num w:numId="6" w16cid:durableId="134301878">
+    <w:abstractNumId w:val="3"/>
+  </w:num>
+  <w:num w:numId="7" w16cid:durableId="1168712703">
+    <w:abstractNumId w:val="11"/>
+  </w:num>
+  <w:num w:numId="8" w16cid:durableId="1998798187">
+    <w:abstractNumId w:val="6"/>
+  </w:num>
+  <w:num w:numId="9" w16cid:durableId="419765496">
+    <w:abstractNumId w:val="4"/>
+  </w:num>
+  <w:num w:numId="10" w16cid:durableId="1402366823">
     <w:abstractNumId w:val="1"/>
   </w:num>
-  <w:num w:numId="2" w16cid:durableId="732389108">
-    <w:abstractNumId w:val="2"/>
+  <w:num w:numId="11" w16cid:durableId="1066142773">
+    <w:abstractNumId w:val="10"/>
   </w:num>
-  <w:num w:numId="3" w16cid:durableId="324170033">
-    <w:abstractNumId w:val="0"/>
+  <w:num w:numId="12" w16cid:durableId="648170114">
+    <w:abstractNumId w:val="7"/>
+  </w:num>
+  <w:num w:numId="13" w16cid:durableId="113790542">
+    <w:abstractNumId w:val="5"/>
   </w:num>
 </w:numbering>
 </file>
@@ -3360,7 +5415,6 @@
     <w:next w:val="Normal"/>
     <w:link w:val="Heading3Char"/>
     <w:uiPriority w:val="9"/>
-    <w:semiHidden/>
     <w:unhideWhenUsed/>
     <w:qFormat/>
     <w:rsid w:val="003E5722"/>
@@ -3383,7 +5437,6 @@
     <w:next w:val="Normal"/>
     <w:link w:val="Heading4Char"/>
     <w:uiPriority w:val="9"/>
-    <w:semiHidden/>
     <w:unhideWhenUsed/>
     <w:qFormat/>
     <w:rsid w:val="003E5722"/>
@@ -3566,7 +5619,6 @@
     <w:basedOn w:val="DefaultParagraphFont"/>
     <w:link w:val="Heading3"/>
     <w:uiPriority w:val="9"/>
-    <w:semiHidden/>
     <w:rsid w:val="003E5722"/>
     <w:rPr>
       <w:rFonts w:eastAsiaTheme="majorEastAsia" w:cstheme="majorBidi"/>
@@ -3580,7 +5632,6 @@
     <w:basedOn w:val="DefaultParagraphFont"/>
     <w:link w:val="Heading4"/>
     <w:uiPriority w:val="9"/>
-    <w:semiHidden/>
     <w:rsid w:val="003E5722"/>
     <w:rPr>
       <w:rFonts w:eastAsiaTheme="majorEastAsia" w:cstheme="majorBidi"/>
@@ -3960,6 +6011,48 @@
       <w:bCs/>
     </w:rPr>
   </w:style>
+  <w:style w:type="character" w:styleId="UnresolvedMention">
+    <w:name w:val="Unresolved Mention"/>
+    <w:basedOn w:val="DefaultParagraphFont"/>
+    <w:uiPriority w:val="99"/>
+    <w:semiHidden/>
+    <w:unhideWhenUsed/>
+    <w:rsid w:val="00E33C90"/>
+    <w:rPr>
+      <w:color w:val="605E5C"/>
+      <w:shd w:val="clear" w:color="auto" w:fill="E1DFDD"/>
+    </w:rPr>
+  </w:style>
+  <w:style w:type="character" w:styleId="FollowedHyperlink">
+    <w:name w:val="FollowedHyperlink"/>
+    <w:basedOn w:val="DefaultParagraphFont"/>
+    <w:uiPriority w:val="99"/>
+    <w:semiHidden/>
+    <w:unhideWhenUsed/>
+    <w:rsid w:val="00E33C90"/>
+    <w:rPr>
+      <w:color w:val="96607D" w:themeColor="followedHyperlink"/>
+      <w:u w:val="single"/>
+    </w:rPr>
+  </w:style>
+  <w:style w:type="character" w:customStyle="1" w:styleId="jsx-427622308">
+    <w:name w:val="jsx-427622308"/>
+    <w:basedOn w:val="DefaultParagraphFont"/>
+    <w:rsid w:val="007E4936"/>
+  </w:style>
+  <w:style w:type="paragraph" w:styleId="TOC3">
+    <w:name w:val="toc 3"/>
+    <w:basedOn w:val="Normal"/>
+    <w:next w:val="Normal"/>
+    <w:autoRedefine/>
+    <w:uiPriority w:val="39"/>
+    <w:unhideWhenUsed/>
+    <w:rsid w:val="001A5452"/>
+    <w:pPr>
+      <w:spacing w:after="100"/>
+      <w:ind w:left="440"/>
+    </w:pPr>
+  </w:style>
 </w:styles>
 </file>
 

</xml_diff>